<commit_message>
Inject vertical watermark presupuesto in all Word headers so it appears on every page of both DOCX and DOC exports
</commit_message>
<xml_diff>
--- a/Ppo_mail_2022_1.docx
+++ b/Ppo_mail_2022_1.docx
@@ -6125,6 +6125,43 @@
       </w:rPr>
     </w:pPr>
   </w:p>
+  <w:p>
+    <w:r>
+      <w:pict>
+        <v:shapetype id="_x0000_t202" coordsize="21600,21600" o:spt="202" path="m,l,21600r21600,l21600,xe">
+          <v:stroke joinstyle="miter"/>
+          <v:path gradientshapeok="t" o:connecttype="rect"/>
+        </v:shapetype>
+        <v:shape id="_x0000_s1163_watermark" type="#_x0000_t202" style="position:absolute;left:0;text-align:left;margin-left:421.25pt;margin-top:114.85pt;width:126pt;height:397.75pt;z-index:251652608" filled="f" stroked="f">
+          <v:textbox style="layout-flow:vertical;mso-layout-flow-alt:bottom-to-top;">
+            <w:txbxContent>
+              <w:p>
+                <w:pPr>
+                  <w:rPr>
+                    <w:rFonts w:ascii="Verdana" w:hAnsi="Verdana"/>
+                    <w:b/>
+                    <w:color w:val="EAEAEA"/>
+                    <w:sz w:val="108"/>
+                    <w:szCs w:val="108"/>
+                  </w:rPr>
+                </w:pPr>
+                <w:r>
+                  <w:rPr>
+                    <w:rFonts w:ascii="Verdana" w:hAnsi="Verdana"/>
+                    <w:b/>
+                    <w:color w:val="EAEAEA"/>
+                    <w:sz w:val="108"/>
+                    <w:szCs w:val="108"/>
+                  </w:rPr>
+                  <w:t>presupuesto</w:t>
+                </w:r>
+              </w:p>
+            </w:txbxContent>
+          </v:textbox>
+        </v:shape>
+      </w:pict>
+    </w:r>
+  </w:p>
 </w:hdr>
 </file>
 
@@ -6342,6 +6379,43 @@
     <w:pPr>
       <w:pStyle w:val="Encabezado"/>
     </w:pPr>
+  </w:p>
+  <w:p>
+    <w:r>
+      <w:pict>
+        <v:shapetype id="_x0000_t202" coordsize="21600,21600" o:spt="202" path="m,l,21600r21600,l21600,xe">
+          <v:stroke joinstyle="miter"/>
+          <v:path gradientshapeok="t" o:connecttype="rect"/>
+        </v:shapetype>
+        <v:shape id="_x0000_s1163_watermark" type="#_x0000_t202" style="position:absolute;left:0;text-align:left;margin-left:421.25pt;margin-top:114.85pt;width:126pt;height:397.75pt;z-index:251652608" filled="f" stroked="f">
+          <v:textbox style="layout-flow:vertical;mso-layout-flow-alt:bottom-to-top;">
+            <w:txbxContent>
+              <w:p>
+                <w:pPr>
+                  <w:rPr>
+                    <w:rFonts w:ascii="Verdana" w:hAnsi="Verdana"/>
+                    <w:b/>
+                    <w:color w:val="EAEAEA"/>
+                    <w:sz w:val="108"/>
+                    <w:szCs w:val="108"/>
+                  </w:rPr>
+                </w:pPr>
+                <w:r>
+                  <w:rPr>
+                    <w:rFonts w:ascii="Verdana" w:hAnsi="Verdana"/>
+                    <w:b/>
+                    <w:color w:val="EAEAEA"/>
+                    <w:sz w:val="108"/>
+                    <w:szCs w:val="108"/>
+                  </w:rPr>
+                  <w:t>presupuesto</w:t>
+                </w:r>
+              </w:p>
+            </w:txbxContent>
+          </v:textbox>
+        </v:shape>
+      </w:pict>
+    </w:r>
   </w:p>
 </w:hdr>
 </file>

</xml_diff>

<commit_message>
Restore clean corporate template Ppo mail 2022 (1).doc without header distortion and with clean cover watermark
</commit_message>
<xml_diff>
--- a/Ppo_mail_2022_1.docx
+++ b/Ppo_mail_2022_1.docx
@@ -6125,43 +6125,6 @@
       </w:rPr>
     </w:pPr>
   </w:p>
-  <w:p>
-    <w:r>
-      <w:pict>
-        <v:shapetype id="_x0000_t202" coordsize="21600,21600" o:spt="202" path="m,l,21600r21600,l21600,xe">
-          <v:stroke joinstyle="miter"/>
-          <v:path gradientshapeok="t" o:connecttype="rect"/>
-        </v:shapetype>
-        <v:shape id="_x0000_s1163_watermark" type="#_x0000_t202" style="position:absolute;left:0;text-align:left;margin-left:421.25pt;margin-top:114.85pt;width:126pt;height:397.75pt;z-index:251652608" filled="f" stroked="f">
-          <v:textbox style="layout-flow:vertical;mso-layout-flow-alt:bottom-to-top;">
-            <w:txbxContent>
-              <w:p>
-                <w:pPr>
-                  <w:rPr>
-                    <w:rFonts w:ascii="Verdana" w:hAnsi="Verdana"/>
-                    <w:b/>
-                    <w:color w:val="EAEAEA"/>
-                    <w:sz w:val="108"/>
-                    <w:szCs w:val="108"/>
-                  </w:rPr>
-                </w:pPr>
-                <w:r>
-                  <w:rPr>
-                    <w:rFonts w:ascii="Verdana" w:hAnsi="Verdana"/>
-                    <w:b/>
-                    <w:color w:val="EAEAEA"/>
-                    <w:sz w:val="108"/>
-                    <w:szCs w:val="108"/>
-                  </w:rPr>
-                  <w:t>presupuesto</w:t>
-                </w:r>
-              </w:p>
-            </w:txbxContent>
-          </v:textbox>
-        </v:shape>
-      </w:pict>
-    </w:r>
-  </w:p>
 </w:hdr>
 </file>
 
@@ -6379,43 +6342,6 @@
     <w:pPr>
       <w:pStyle w:val="Encabezado"/>
     </w:pPr>
-  </w:p>
-  <w:p>
-    <w:r>
-      <w:pict>
-        <v:shapetype id="_x0000_t202" coordsize="21600,21600" o:spt="202" path="m,l,21600r21600,l21600,xe">
-          <v:stroke joinstyle="miter"/>
-          <v:path gradientshapeok="t" o:connecttype="rect"/>
-        </v:shapetype>
-        <v:shape id="_x0000_s1163_watermark" type="#_x0000_t202" style="position:absolute;left:0;text-align:left;margin-left:421.25pt;margin-top:114.85pt;width:126pt;height:397.75pt;z-index:251652608" filled="f" stroked="f">
-          <v:textbox style="layout-flow:vertical;mso-layout-flow-alt:bottom-to-top;">
-            <w:txbxContent>
-              <w:p>
-                <w:pPr>
-                  <w:rPr>
-                    <w:rFonts w:ascii="Verdana" w:hAnsi="Verdana"/>
-                    <w:b/>
-                    <w:color w:val="EAEAEA"/>
-                    <w:sz w:val="108"/>
-                    <w:szCs w:val="108"/>
-                  </w:rPr>
-                </w:pPr>
-                <w:r>
-                  <w:rPr>
-                    <w:rFonts w:ascii="Verdana" w:hAnsi="Verdana"/>
-                    <w:b/>
-                    <w:color w:val="EAEAEA"/>
-                    <w:sz w:val="108"/>
-                    <w:szCs w:val="108"/>
-                  </w:rPr>
-                  <w:t>presupuesto</w:t>
-                </w:r>
-              </w:p>
-            </w:txbxContent>
-          </v:textbox>
-        </v:shape>
-      </w:pict>
-    </w:r>
   </w:p>
 </w:hdr>
 </file>
@@ -9912,7 +9838,7 @@
 </file>
 
 <file path=customXml/itemProps1.xml><?xml version="1.0" encoding="utf-8"?>
-<ds:datastoreItem xmlns:ds="http://schemas.openxmlformats.org/officeDocument/2006/customXml" ds:itemID="{7B8ACA29-D401-41D9-B229-A4042E1108B2}">
+<ds:datastoreItem xmlns:ds="http://schemas.openxmlformats.org/officeDocument/2006/customXml" ds:itemID="{35EF4190-1B99-4716-BA7F-F323CE53580B}">
   <ds:schemaRefs>
     <ds:schemaRef ds:uri="http://schemas.openxmlformats.org/officeDocument/2006/bibliography"/>
   </ds:schemaRefs>

</xml_diff>